<commit_message>
docs: add PDF exports and regenerator script
Generate bilingual PDF guides alongside Word, document rebuild commands, and refresh distribution index files.

Co-authored-by: Cursor <cursoragent@cursor.com>
</commit_message>
<xml_diff>
--- a/docs/word/Documentation-Index.docx
+++ b/docs/word/Documentation-Index.docx
@@ -89,7 +89,7 @@
                 <w:b/>
                 <w:sz w:val="20"/>
               </w:rPr>
-              <w:t>User Guide (Word)</w:t>
+              <w:t>Word</w:t>
             </w:r>
           </w:p>
         </w:tc>
@@ -105,7 +105,7 @@
                 <w:b/>
                 <w:sz w:val="20"/>
               </w:rPr>
-              <w:t>Technical Guide (Word)</w:t>
+              <w:t>PDF</w:t>
             </w:r>
           </w:p>
         </w:tc>
@@ -167,7 +167,7 @@
                 <w:rFonts w:ascii="Calibri" w:hAnsi="Calibri" w:eastAsia="Microsoft JhengHei"/>
                 <w:sz w:val="20"/>
               </w:rPr>
-              <w:t>word/USER_GUIDE.zh-TW.docx</w:t>
+              <w:t>word/USER_GUIDE.zh-TW.docx / word/TECHNICAL.zh-TW.docx</w:t>
             </w:r>
           </w:p>
         </w:tc>
@@ -182,7 +182,7 @@
                 <w:rFonts w:ascii="Calibri" w:hAnsi="Calibri" w:eastAsia="Microsoft JhengHei"/>
                 <w:sz w:val="20"/>
               </w:rPr>
-              <w:t>word/TECHNICAL.zh-TW.docx</w:t>
+              <w:t>pdf/USER_GUIDE.zh-TW.pdf / pdf/TECHNICAL.zh-TW.pdf</w:t>
             </w:r>
           </w:p>
         </w:tc>
@@ -244,7 +244,7 @@
                 <w:rFonts w:ascii="Calibri" w:hAnsi="Calibri" w:eastAsia="Microsoft JhengHei"/>
                 <w:sz w:val="20"/>
               </w:rPr>
-              <w:t>word/USER_GUIDE.en.docx</w:t>
+              <w:t>word/USER_GUIDE.en.docx / word/TECHNICAL.en.docx</w:t>
             </w:r>
           </w:p>
         </w:tc>
@@ -259,7 +259,7 @@
                 <w:rFonts w:ascii="Calibri" w:hAnsi="Calibri" w:eastAsia="Microsoft JhengHei"/>
                 <w:sz w:val="20"/>
               </w:rPr>
-              <w:t>word/TECHNICAL.en.docx</w:t>
+              <w:t>pdf/USER_GUIDE.en.pdf / pdf/TECHNICAL.en.pdf</w:t>
             </w:r>
           </w:p>
         </w:tc>
@@ -272,8 +272,13 @@
           <w:rFonts w:ascii="Calibri" w:hAnsi="Calibri" w:eastAsia="Microsoft JhengHei"/>
           <w:sz w:val="22"/>
         </w:rPr>
-        <w:t xml:space="preserve">Also available: </w:t>
+        <w:t>Also available:</w:t>
       </w:r>
+    </w:p>
+    <w:p>
+      <w:pPr>
+        <w:pStyle w:val="ListBullet"/>
+      </w:pPr>
       <w:r>
         <w:rPr>
           <w:rFonts w:ascii="Calibri" w:hAnsi="Calibri" w:eastAsia="Microsoft JhengHei"/>
@@ -281,6 +286,19 @@
           <w:sz w:val="22"/>
         </w:rPr>
         <w:t>word/Documentation-Index.docx (./word/Documentation-Index.docx)</w:t>
+      </w:r>
+    </w:p>
+    <w:p>
+      <w:pPr>
+        <w:pStyle w:val="ListBullet"/>
+      </w:pPr>
+      <w:r>
+        <w:rPr>
+          <w:rFonts w:ascii="Calibri" w:hAnsi="Calibri" w:eastAsia="Microsoft JhengHei"/>
+          <w:color w:val="0563C1"/>
+          <w:sz w:val="22"/>
+        </w:rPr>
+        <w:t>pdf/Documentation-Index.pdf (./pdf/Documentation-Index.pdf)</w:t>
       </w:r>
     </w:p>
     <w:p>
@@ -333,7 +351,7 @@
           <w:b/>
           <w:sz w:val="28"/>
         </w:rPr>
-        <w:t>Regenerate Word files</w:t>
+        <w:t>Regenerate Word / PDF files</w:t>
       </w:r>
     </w:p>
     <w:p>
@@ -342,22 +360,7 @@
           <w:rFonts w:ascii="Calibri" w:hAnsi="Calibri" w:eastAsia="Microsoft JhengHei"/>
           <w:sz w:val="22"/>
         </w:rPr>
-        <w:t xml:space="preserve">After editing Markdown, rebuild </w:t>
-      </w:r>
-      <w:r>
-        <w:rPr>
-          <w:rFonts w:ascii="Consolas" w:hAnsi="Consolas" w:eastAsia="Consolas"/>
-          <w:color w:val="333333"/>
-          <w:sz w:val="22"/>
-        </w:rPr>
-        <w:t>.docx</w:t>
-      </w:r>
-      <w:r>
-        <w:rPr>
-          <w:rFonts w:ascii="Calibri" w:hAnsi="Calibri" w:eastAsia="Microsoft JhengHei"/>
-          <w:sz w:val="22"/>
-        </w:rPr>
-        <w:t>:</w:t>
+        <w:t>After editing Markdown, rebuild distribution files:</w:t>
       </w:r>
     </w:p>
     <w:p>
@@ -374,6 +377,48 @@
         <w:t>python3 -m pip install -r requirements.txt</w:t>
         <w:br/>
         <w:t>python3 scripts/md_to_docx.py</w:t>
+        <w:br/>
+        <w:t>python3 scripts/md_to_pdf.py</w:t>
+      </w:r>
+    </w:p>
+    <w:p>
+      <w:pPr>
+        <w:pStyle w:val="ListBullet"/>
+      </w:pPr>
+      <w:r>
+        <w:rPr>
+          <w:rFonts w:ascii="Calibri" w:hAnsi="Calibri" w:eastAsia="Microsoft JhengHei"/>
+          <w:sz w:val="22"/>
+        </w:rPr>
+        <w:t>Word 輸出目錄：</w:t>
+      </w:r>
+      <w:r>
+        <w:rPr>
+          <w:rFonts w:ascii="Consolas" w:hAnsi="Consolas" w:eastAsia="Consolas"/>
+          <w:color w:val="333333"/>
+          <w:sz w:val="22"/>
+        </w:rPr>
+        <w:t>docs/word/</w:t>
+      </w:r>
+    </w:p>
+    <w:p>
+      <w:pPr>
+        <w:pStyle w:val="ListBullet"/>
+      </w:pPr>
+      <w:r>
+        <w:rPr>
+          <w:rFonts w:ascii="Calibri" w:hAnsi="Calibri" w:eastAsia="Microsoft JhengHei"/>
+          <w:sz w:val="22"/>
+        </w:rPr>
+        <w:t>PDF 輸出目錄：</w:t>
+      </w:r>
+      <w:r>
+        <w:rPr>
+          <w:rFonts w:ascii="Consolas" w:hAnsi="Consolas" w:eastAsia="Consolas"/>
+          <w:color w:val="333333"/>
+          <w:sz w:val="22"/>
+        </w:rPr>
+        <w:t>docs/pdf/</w:t>
       </w:r>
     </w:p>
     <w:sectPr>

</xml_diff>

<commit_message>
feat: use external cron for reliable FX update triggers
Switch primary scheduling to workflow_dispatch via trigger script and cron-job.org docs, keep sparse GitHub schedule as backup, and add scheduling guides with Word/PDF exports.

Co-authored-by: Cursor <cursoragent@cursor.com>
</commit_message>
<xml_diff>
--- a/docs/word/Documentation-Index.docx
+++ b/docs/word/Documentation-Index.docx
@@ -22,16 +22,15 @@
         <w:tblLook w:firstColumn="1" w:firstRow="1" w:lastColumn="0" w:lastRow="0" w:noHBand="0" w:noVBand="1" w:val="04A0"/>
       </w:tblPr>
       <w:tblGrid>
-        <w:gridCol w:w="1930"/>
-        <w:gridCol w:w="1930"/>
-        <w:gridCol w:w="1930"/>
-        <w:gridCol w:w="1930"/>
-        <w:gridCol w:w="1930"/>
+        <w:gridCol w:w="2412"/>
+        <w:gridCol w:w="2412"/>
+        <w:gridCol w:w="2412"/>
+        <w:gridCol w:w="2412"/>
       </w:tblGrid>
       <w:tr>
         <w:tc>
           <w:tcPr>
-            <w:tcW w:type="dxa" w:w="1930"/>
+            <w:tcW w:type="dxa" w:w="2412"/>
           </w:tcPr>
           <w:p>
             <w:r/>
@@ -47,7 +46,7 @@
         </w:tc>
         <w:tc>
           <w:tcPr>
-            <w:tcW w:type="dxa" w:w="1930"/>
+            <w:tcW w:type="dxa" w:w="2412"/>
           </w:tcPr>
           <w:p>
             <w:r/>
@@ -57,13 +56,13 @@
                 <w:b/>
                 <w:sz w:val="20"/>
               </w:rPr>
-              <w:t>User Guide (Markdown)</w:t>
+              <w:t>User Guide</w:t>
             </w:r>
           </w:p>
         </w:tc>
         <w:tc>
           <w:tcPr>
-            <w:tcW w:type="dxa" w:w="1930"/>
+            <w:tcW w:type="dxa" w:w="2412"/>
           </w:tcPr>
           <w:p>
             <w:r/>
@@ -73,13 +72,194 @@
                 <w:b/>
                 <w:sz w:val="20"/>
               </w:rPr>
-              <w:t>Technical Guide (Markdown)</w:t>
+              <w:t>Technical Guide</w:t>
             </w:r>
           </w:p>
         </w:tc>
         <w:tc>
           <w:tcPr>
-            <w:tcW w:type="dxa" w:w="1930"/>
+            <w:tcW w:type="dxa" w:w="2412"/>
+          </w:tcPr>
+          <w:p>
+            <w:r/>
+            <w:r>
+              <w:rPr>
+                <w:rFonts w:ascii="Calibri" w:hAnsi="Calibri" w:eastAsia="Microsoft JhengHei"/>
+                <w:b/>
+                <w:sz w:val="20"/>
+              </w:rPr>
+              <w:t>Scheduling</w:t>
+            </w:r>
+          </w:p>
+        </w:tc>
+      </w:tr>
+      <w:tr>
+        <w:tc>
+          <w:tcPr>
+            <w:tcW w:type="dxa" w:w="2412"/>
+          </w:tcPr>
+          <w:p>
+            <w:r/>
+            <w:r>
+              <w:rPr>
+                <w:rFonts w:ascii="Calibri" w:hAnsi="Calibri" w:eastAsia="Microsoft JhengHei"/>
+                <w:sz w:val="20"/>
+              </w:rPr>
+              <w:t>繁體中文</w:t>
+            </w:r>
+          </w:p>
+        </w:tc>
+        <w:tc>
+          <w:tcPr>
+            <w:tcW w:type="dxa" w:w="2412"/>
+          </w:tcPr>
+          <w:p>
+            <w:r/>
+            <w:r>
+              <w:rPr>
+                <w:rFonts w:ascii="Calibri" w:hAnsi="Calibri" w:eastAsia="Microsoft JhengHei"/>
+                <w:sz w:val="20"/>
+              </w:rPr>
+              <w:t>USER_GUIDE.zh-TW.md</w:t>
+            </w:r>
+          </w:p>
+        </w:tc>
+        <w:tc>
+          <w:tcPr>
+            <w:tcW w:type="dxa" w:w="2412"/>
+          </w:tcPr>
+          <w:p>
+            <w:r/>
+            <w:r>
+              <w:rPr>
+                <w:rFonts w:ascii="Calibri" w:hAnsi="Calibri" w:eastAsia="Microsoft JhengHei"/>
+                <w:sz w:val="20"/>
+              </w:rPr>
+              <w:t>TECHNICAL.zh-TW.md</w:t>
+            </w:r>
+          </w:p>
+        </w:tc>
+        <w:tc>
+          <w:tcPr>
+            <w:tcW w:type="dxa" w:w="2412"/>
+          </w:tcPr>
+          <w:p>
+            <w:r/>
+            <w:r>
+              <w:rPr>
+                <w:rFonts w:ascii="Calibri" w:hAnsi="Calibri" w:eastAsia="Microsoft JhengHei"/>
+                <w:sz w:val="20"/>
+              </w:rPr>
+              <w:t>SCHEDULING.zh-TW.md</w:t>
+            </w:r>
+          </w:p>
+        </w:tc>
+      </w:tr>
+      <w:tr>
+        <w:tc>
+          <w:tcPr>
+            <w:tcW w:type="dxa" w:w="2412"/>
+          </w:tcPr>
+          <w:p>
+            <w:r/>
+            <w:r>
+              <w:rPr>
+                <w:rFonts w:ascii="Calibri" w:hAnsi="Calibri" w:eastAsia="Microsoft JhengHei"/>
+                <w:sz w:val="20"/>
+              </w:rPr>
+              <w:t>English</w:t>
+            </w:r>
+          </w:p>
+        </w:tc>
+        <w:tc>
+          <w:tcPr>
+            <w:tcW w:type="dxa" w:w="2412"/>
+          </w:tcPr>
+          <w:p>
+            <w:r/>
+            <w:r>
+              <w:rPr>
+                <w:rFonts w:ascii="Calibri" w:hAnsi="Calibri" w:eastAsia="Microsoft JhengHei"/>
+                <w:sz w:val="20"/>
+              </w:rPr>
+              <w:t>USER_GUIDE.en.md</w:t>
+            </w:r>
+          </w:p>
+        </w:tc>
+        <w:tc>
+          <w:tcPr>
+            <w:tcW w:type="dxa" w:w="2412"/>
+          </w:tcPr>
+          <w:p>
+            <w:r/>
+            <w:r>
+              <w:rPr>
+                <w:rFonts w:ascii="Calibri" w:hAnsi="Calibri" w:eastAsia="Microsoft JhengHei"/>
+                <w:sz w:val="20"/>
+              </w:rPr>
+              <w:t>TECHNICAL.en.md</w:t>
+            </w:r>
+          </w:p>
+        </w:tc>
+        <w:tc>
+          <w:tcPr>
+            <w:tcW w:type="dxa" w:w="2412"/>
+          </w:tcPr>
+          <w:p>
+            <w:r/>
+            <w:r>
+              <w:rPr>
+                <w:rFonts w:ascii="Calibri" w:hAnsi="Calibri" w:eastAsia="Microsoft JhengHei"/>
+                <w:sz w:val="20"/>
+              </w:rPr>
+              <w:t>SCHEDULING.en.md</w:t>
+            </w:r>
+          </w:p>
+        </w:tc>
+      </w:tr>
+    </w:tbl>
+    <w:p/>
+    <w:p>
+      <w:r>
+        <w:rPr>
+          <w:rFonts w:ascii="Calibri" w:hAnsi="Calibri" w:eastAsia="Microsoft JhengHei"/>
+          <w:b/>
+          <w:sz w:val="22"/>
+        </w:rPr>
+        <w:t>Word / PDF</w:t>
+      </w:r>
+    </w:p>
+    <w:tbl>
+      <w:tblPr>
+        <w:tblStyle w:val="TableGrid"/>
+        <w:tblW w:type="auto" w:w="0"/>
+        <w:tblLook w:firstColumn="1" w:firstRow="1" w:lastColumn="0" w:lastRow="0" w:noHBand="0" w:noVBand="1" w:val="04A0"/>
+      </w:tblPr>
+      <w:tblGrid>
+        <w:gridCol w:w="3216"/>
+        <w:gridCol w:w="3216"/>
+        <w:gridCol w:w="3216"/>
+      </w:tblGrid>
+      <w:tr>
+        <w:tc>
+          <w:tcPr>
+            <w:tcW w:type="dxa" w:w="3216"/>
+          </w:tcPr>
+          <w:p>
+            <w:r/>
+            <w:r>
+              <w:rPr>
+                <w:rFonts w:ascii="Calibri" w:hAnsi="Calibri" w:eastAsia="Microsoft JhengHei"/>
+                <w:b/>
+                <w:sz w:val="20"/>
+              </w:rPr>
+              <w:t>Language</w:t>
+            </w:r>
+          </w:p>
+        </w:tc>
+        <w:tc>
+          <w:tcPr>
+            <w:tcW w:type="dxa" w:w="3216"/>
           </w:tcPr>
           <w:p>
             <w:r/>
@@ -95,7 +275,7 @@
         </w:tc>
         <w:tc>
           <w:tcPr>
-            <w:tcW w:type="dxa" w:w="1930"/>
+            <w:tcW w:type="dxa" w:w="3216"/>
           </w:tcPr>
           <w:p>
             <w:r/>
@@ -113,7 +293,7 @@
       <w:tr>
         <w:tc>
           <w:tcPr>
-            <w:tcW w:type="dxa" w:w="1930"/>
+            <w:tcW w:type="dxa" w:w="3216"/>
           </w:tcPr>
           <w:p>
             <w:r/>
@@ -128,7 +308,7 @@
         </w:tc>
         <w:tc>
           <w:tcPr>
-            <w:tcW w:type="dxa" w:w="1930"/>
+            <w:tcW w:type="dxa" w:w="3216"/>
           </w:tcPr>
           <w:p>
             <w:r/>
@@ -137,13 +317,13 @@
                 <w:rFonts w:ascii="Calibri" w:hAnsi="Calibri" w:eastAsia="Microsoft JhengHei"/>
                 <w:sz w:val="20"/>
               </w:rPr>
-              <w:t>USER_GUIDE.zh-TW.md</w:t>
+              <w:t>word/USER_GUIDE.zh-TW.docx · word/TECHNICAL.zh-TW.docx · word/SCHEDULING.zh-TW.docx</w:t>
             </w:r>
           </w:p>
         </w:tc>
         <w:tc>
           <w:tcPr>
-            <w:tcW w:type="dxa" w:w="1930"/>
+            <w:tcW w:type="dxa" w:w="3216"/>
           </w:tcPr>
           <w:p>
             <w:r/>
@@ -152,37 +332,7 @@
                 <w:rFonts w:ascii="Calibri" w:hAnsi="Calibri" w:eastAsia="Microsoft JhengHei"/>
                 <w:sz w:val="20"/>
               </w:rPr>
-              <w:t>TECHNICAL.zh-TW.md</w:t>
-            </w:r>
-          </w:p>
-        </w:tc>
-        <w:tc>
-          <w:tcPr>
-            <w:tcW w:type="dxa" w:w="1930"/>
-          </w:tcPr>
-          <w:p>
-            <w:r/>
-            <w:r>
-              <w:rPr>
-                <w:rFonts w:ascii="Calibri" w:hAnsi="Calibri" w:eastAsia="Microsoft JhengHei"/>
-                <w:sz w:val="20"/>
-              </w:rPr>
-              <w:t>word/USER_GUIDE.zh-TW.docx / word/TECHNICAL.zh-TW.docx</w:t>
-            </w:r>
-          </w:p>
-        </w:tc>
-        <w:tc>
-          <w:tcPr>
-            <w:tcW w:type="dxa" w:w="1930"/>
-          </w:tcPr>
-          <w:p>
-            <w:r/>
-            <w:r>
-              <w:rPr>
-                <w:rFonts w:ascii="Calibri" w:hAnsi="Calibri" w:eastAsia="Microsoft JhengHei"/>
-                <w:sz w:val="20"/>
-              </w:rPr>
-              <w:t>pdf/USER_GUIDE.zh-TW.pdf / pdf/TECHNICAL.zh-TW.pdf</w:t>
+              <w:t>pdf/USER_GUIDE.zh-TW.pdf · pdf/TECHNICAL.zh-TW.pdf · pdf/SCHEDULING.zh-TW.pdf</w:t>
             </w:r>
           </w:p>
         </w:tc>
@@ -190,7 +340,7 @@
       <w:tr>
         <w:tc>
           <w:tcPr>
-            <w:tcW w:type="dxa" w:w="1930"/>
+            <w:tcW w:type="dxa" w:w="3216"/>
           </w:tcPr>
           <w:p>
             <w:r/>
@@ -205,7 +355,7 @@
         </w:tc>
         <w:tc>
           <w:tcPr>
-            <w:tcW w:type="dxa" w:w="1930"/>
+            <w:tcW w:type="dxa" w:w="3216"/>
           </w:tcPr>
           <w:p>
             <w:r/>
@@ -214,13 +364,13 @@
                 <w:rFonts w:ascii="Calibri" w:hAnsi="Calibri" w:eastAsia="Microsoft JhengHei"/>
                 <w:sz w:val="20"/>
               </w:rPr>
-              <w:t>USER_GUIDE.en.md</w:t>
+              <w:t>word/USER_GUIDE.en.docx · word/TECHNICAL.en.docx · word/SCHEDULING.en.docx</w:t>
             </w:r>
           </w:p>
         </w:tc>
         <w:tc>
           <w:tcPr>
-            <w:tcW w:type="dxa" w:w="1930"/>
+            <w:tcW w:type="dxa" w:w="3216"/>
           </w:tcPr>
           <w:p>
             <w:r/>
@@ -229,37 +379,7 @@
                 <w:rFonts w:ascii="Calibri" w:hAnsi="Calibri" w:eastAsia="Microsoft JhengHei"/>
                 <w:sz w:val="20"/>
               </w:rPr>
-              <w:t>TECHNICAL.en.md</w:t>
-            </w:r>
-          </w:p>
-        </w:tc>
-        <w:tc>
-          <w:tcPr>
-            <w:tcW w:type="dxa" w:w="1930"/>
-          </w:tcPr>
-          <w:p>
-            <w:r/>
-            <w:r>
-              <w:rPr>
-                <w:rFonts w:ascii="Calibri" w:hAnsi="Calibri" w:eastAsia="Microsoft JhengHei"/>
-                <w:sz w:val="20"/>
-              </w:rPr>
-              <w:t>word/USER_GUIDE.en.docx / word/TECHNICAL.en.docx</w:t>
-            </w:r>
-          </w:p>
-        </w:tc>
-        <w:tc>
-          <w:tcPr>
-            <w:tcW w:type="dxa" w:w="1930"/>
-          </w:tcPr>
-          <w:p>
-            <w:r/>
-            <w:r>
-              <w:rPr>
-                <w:rFonts w:ascii="Calibri" w:hAnsi="Calibri" w:eastAsia="Microsoft JhengHei"/>
-                <w:sz w:val="20"/>
-              </w:rPr>
-              <w:t>pdf/USER_GUIDE.en.pdf / pdf/TECHNICAL.en.pdf</w:t>
+              <w:t>pdf/USER_GUIDE.en.pdf · pdf/TECHNICAL.en.pdf · pdf/SCHEDULING.en.pdf</w:t>
             </w:r>
           </w:p>
         </w:tc>
@@ -318,7 +438,7 @@
           <w:rFonts w:ascii="Calibri" w:hAnsi="Calibri" w:eastAsia="Microsoft JhengHei"/>
           <w:sz w:val="22"/>
         </w:rPr>
-        <w:t>: CDN URLs, NetSuite admin setup, schedule, FAQ</w:t>
+        <w:t>: CDN URLs, NetSuite admin setup, schedule overview, FAQ</w:t>
       </w:r>
     </w:p>
     <w:p>
@@ -338,7 +458,27 @@
           <w:rFonts w:ascii="Calibri" w:hAnsi="Calibri" w:eastAsia="Microsoft JhengHei"/>
           <w:sz w:val="22"/>
         </w:rPr>
-        <w:t>: architecture, CSV/JSON contract, Actions, how to change download / transform / SuiteScript logic</w:t>
+        <w:t>: architecture, CSV/JSON contract, Actions, how to change logic</w:t>
+      </w:r>
+    </w:p>
+    <w:p>
+      <w:pPr>
+        <w:pStyle w:val="ListBullet"/>
+      </w:pPr>
+      <w:r>
+        <w:rPr>
+          <w:rFonts w:ascii="Calibri" w:hAnsi="Calibri" w:eastAsia="Microsoft JhengHei"/>
+          <w:b/>
+          <w:sz w:val="22"/>
+        </w:rPr>
+        <w:t>Scheduling</w:t>
+      </w:r>
+      <w:r>
+        <w:rPr>
+          <w:rFonts w:ascii="Calibri" w:hAnsi="Calibri" w:eastAsia="Microsoft JhengHei"/>
+          <w:sz w:val="22"/>
+        </w:rPr>
+        <w:t>: reliable external cron setup (cron-job.org) + trigger script</w:t>
       </w:r>
     </w:p>
     <w:p>

</xml_diff>